<commit_message>
final sprint 3 submission
</commit_message>
<xml_diff>
--- a/documentation/Sprint 3/Sprint_3_Reflection.docx
+++ b/documentation/Sprint 3/Sprint_3_Reflection.docx
@@ -460,6 +460,102 @@
           <w:szCs w:val="24"/>
         </w:rPr>
       </w:pPr>
+      <w:r>
+        <w:rPr>
+          <w:rFonts w:ascii="Times New Roman" w:eastAsia="Times New Roman" w:hAnsi="Times New Roman" w:cs="Times New Roman"/>
+          <w:sz w:val="24"/>
+          <w:szCs w:val="24"/>
+        </w:rPr>
+        <w:t>Owen:</w:t>
+      </w:r>
+    </w:p>
+    <w:p>
+      <w:pPr>
+        <w:rPr>
+          <w:rFonts w:ascii="Times New Roman" w:eastAsia="Times New Roman" w:hAnsi="Times New Roman" w:cs="Times New Roman"/>
+          <w:sz w:val="24"/>
+          <w:szCs w:val="24"/>
+        </w:rPr>
+      </w:pPr>
+      <w:r>
+        <w:rPr>
+          <w:rFonts w:ascii="Times New Roman" w:eastAsia="Times New Roman" w:hAnsi="Times New Roman" w:cs="Times New Roman"/>
+          <w:sz w:val="24"/>
+          <w:szCs w:val="24"/>
+        </w:rPr>
+        <w:tab/>
+        <w:t>I agree with a lot of what was mentioned here. The communication has been significantly better, and our efficiency has improved a lot. We get to finish this project way ahead of time and check with graders constantly. We can still improve on the code quality of this project, but the overall work pace is good.</w:t>
+      </w:r>
+    </w:p>
+    <w:p>
+      <w:pPr>
+        <w:rPr>
+          <w:rFonts w:ascii="Times New Roman" w:eastAsia="Times New Roman" w:hAnsi="Times New Roman" w:cs="Times New Roman"/>
+          <w:sz w:val="24"/>
+          <w:szCs w:val="24"/>
+        </w:rPr>
+      </w:pPr>
+      <w:r>
+        <w:rPr>
+          <w:rFonts w:ascii="Times New Roman" w:eastAsia="Times New Roman" w:hAnsi="Times New Roman" w:cs="Times New Roman"/>
+          <w:sz w:val="24"/>
+          <w:szCs w:val="24"/>
+        </w:rPr>
+        <w:t>Lohith:</w:t>
+      </w:r>
+    </w:p>
+    <w:p>
+      <w:pPr>
+        <w:rPr>
+          <w:rFonts w:ascii="Times New Roman" w:eastAsia="Times New Roman" w:hAnsi="Times New Roman" w:cs="Times New Roman"/>
+          <w:sz w:val="24"/>
+          <w:szCs w:val="24"/>
+        </w:rPr>
+      </w:pPr>
+      <w:r>
+        <w:rPr>
+          <w:rFonts w:ascii="Times New Roman" w:eastAsia="Times New Roman" w:hAnsi="Times New Roman" w:cs="Times New Roman"/>
+          <w:sz w:val="24"/>
+          <w:szCs w:val="24"/>
+        </w:rPr>
+        <w:tab/>
+        <w:t>This document essentially echoes my own thoughts, and I have nothing else to mention that has not been mentioned before.</w:t>
+      </w:r>
+    </w:p>
+    <w:p>
+      <w:pPr>
+        <w:rPr>
+          <w:rFonts w:ascii="Times New Roman" w:eastAsia="Times New Roman" w:hAnsi="Times New Roman" w:cs="Times New Roman"/>
+          <w:sz w:val="24"/>
+          <w:szCs w:val="24"/>
+        </w:rPr>
+      </w:pPr>
+      <w:r>
+        <w:rPr>
+          <w:rFonts w:ascii="Times New Roman" w:eastAsia="Times New Roman" w:hAnsi="Times New Roman" w:cs="Times New Roman"/>
+          <w:sz w:val="24"/>
+          <w:szCs w:val="24"/>
+        </w:rPr>
+        <w:t>Akari:</w:t>
+      </w:r>
+    </w:p>
+    <w:p>
+      <w:pPr>
+        <w:rPr>
+          <w:rFonts w:ascii="Times New Roman" w:eastAsia="Times New Roman" w:hAnsi="Times New Roman" w:cs="Times New Roman"/>
+          <w:sz w:val="24"/>
+          <w:szCs w:val="24"/>
+        </w:rPr>
+      </w:pPr>
+      <w:r>
+        <w:rPr>
+          <w:rFonts w:ascii="Times New Roman" w:eastAsia="Times New Roman" w:hAnsi="Times New Roman" w:cs="Times New Roman"/>
+          <w:sz w:val="24"/>
+          <w:szCs w:val="24"/>
+        </w:rPr>
+        <w:tab/>
+        <w:t>I agree with what was said in the reflection and by others in their own individual thoughts.</w:t>
+      </w:r>
     </w:p>
     <w:sectPr>
       <w:pgSz w:w="12240" w:h="15840"/>

</xml_diff>